<commit_message>
Add Krenz and Amann (2025) evidence and London UHI map to note
Co-Authored-By: Claude Opus 5.5 <noreply@anthropic.com>
Claude-Session: https://claude.ai/code/session_0195XY8VyR4bHAzfsKBhnzYi
</commit_message>
<xml_diff>
--- a/docs/Southwark_UHI_Evidence_Note.docx
+++ b/docs/Southwark_UHI_Evidence_Note.docx
@@ -209,7 +209,7 @@
         <w:pStyle w:val="Bulletstyle"/>
       </w:pPr>
       <w:r>
-        <w:t xml:space="preserve">young children, Asian and Black residents and lower-income groups in London face surface temperatures up to 4°C hotter than wealthier, mainly White populations (Krenz and Amann, 2025)</w:t>
+        <w:t xml:space="preserve">8% of Greater London (14 km²) is a persistent heat island, with mean summer surface temperature of 40.56°C or more over 2013 to 2023; clusters sit in east London, the western edge and south of the Thames (Krenz and Amann, 2025)</w:t>
       </w:r>
     </w:p>
     <w:p>
@@ -217,7 +217,23 @@
         <w:pStyle w:val="Bulletstyle"/>
       </w:pPr>
       <w:r>
-        <w:t xml:space="preserve">hot streets show 6 to 9% lower walking accessibility, limiting movement for the most exposed groups (Krenz and Amann, 2025)</w:t>
+        <w:t xml:space="preserve">Asian (39.10°C) and Black (39.00°C) residents face higher mean surface temperatures than White residents (38.57°C); children aged 4 and under face the highest of any age group (Krenz and Amann, 2025)</w:t>
+      </w:r>
+    </w:p>
+    <w:p>
+      <w:pPr>
+        <w:pStyle w:val="Bulletstyle"/>
+      </w:pPr>
+      <w:r>
+        <w:t xml:space="preserve">the least well-off are exposed to surface temperatures 4.38°C higher than the most affluent (90th against 10th percentile) (Krenz and Amann, 2025)</w:t>
+      </w:r>
+    </w:p>
+    <w:p>
+      <w:pPr>
+        <w:pStyle w:val="Bulletstyle"/>
+      </w:pPr>
+      <w:r>
+        <w:t xml:space="preserve">heat reduces walking accessibility in affected areas by 6 to 9%, hitting Asian and Black communities hardest (Krenz and Amann, 2025)</w:t>
       </w:r>
     </w:p>
     <w:p>
@@ -258,7 +274,7 @@
           <wp:inline distT="0" distB="0" distL="0" distR="0">
             <wp:extent cx="3240000" cy="3616008"/>
             <wp:effectExtent l="0" t="0" r="0" b="0"/>
-            <wp:docPr id="416952" name="Picture 416952" descr="Map of Southwark LSOAs shaded by UHeatRank from 1 (pale, coolest) to 5 (dark red, hottest). The north and centre of the borough rank highest; the south and large parks rank lowest."/>
+            <wp:docPr id="940590" name="Picture 940590" descr="Map of Southwark LSOAs shaded by UHeatRank from 1 (pale, coolest) to 5 (dark red, hottest). The north and centre of the borough rank highest; the south and large parks rank lowest."/>
             <wp:cNvGraphicFramePr>
               <a:graphicFrameLocks xmlns:a="http://schemas.openxmlformats.org/drawingml/2006/main" noChangeAspect="1"/>
             </wp:cNvGraphicFramePr>
@@ -266,7 +282,7 @@
               <a:graphicData uri="http://schemas.openxmlformats.org/drawingml/2006/picture">
                 <pic:pic xmlns:pic="http://schemas.openxmlformats.org/drawingml/2006/picture">
                   <pic:nvPicPr>
-                    <pic:cNvPr id="416952" name="Picture 416952" descr="Map of Southwark LSOAs shaded by UHeatRank from 1 (pale, coolest) to 5 (dark red, hottest). The north and centre of the borough rank highest; the south and large parks rank lowest."/>
+                    <pic:cNvPr id="940590" name="Picture 940590" descr="Map of Southwark LSOAs shaded by UHeatRank from 1 (pale, coolest) to 5 (dark red, hottest). The north and centre of the borough rank highest; the south and large parks rank lowest."/>
                     <pic:cNvPicPr/>
                   </pic:nvPicPr>
                   <pic:blipFill>
@@ -306,12 +322,72 @@
         <w:pStyle w:val="Heading2"/>
       </w:pPr>
       <w:r>
+        <w:t xml:space="preserve">London heat island map</w:t>
+      </w:r>
+    </w:p>
+    <w:p>
+      <w:r>
+        <w:t xml:space="preserve">Krenz and Amann (2025) map persistent heat islands across London from Landsat summer imagery, 2013 to 2023, at 30 m resolution. Areas shown have mean surface temperature of 40.56°C or more.</w:t>
+      </w:r>
+    </w:p>
+    <w:p>
+      <w:r>
+        <w:rPr>
+          <w:noProof/>
+        </w:rPr>
+        <w:drawing>
+          <wp:inline distT="0" distB="0" distL="0" distR="0">
+            <wp:extent cx="3240000" cy="3311494"/>
+            <wp:effectExtent l="0" t="0" r="0" b="0"/>
+            <wp:docPr id="77681" name="Picture 77681" descr="Map of Greater London with a 10 km buffer. Red patches mark persistent urban heat island areas with mean land surface temperature of 40.56°C or more, clustered in east London, the western edge and south of the River Thames."/>
+            <wp:cNvGraphicFramePr>
+              <a:graphicFrameLocks xmlns:a="http://schemas.openxmlformats.org/drawingml/2006/main" noChangeAspect="1"/>
+            </wp:cNvGraphicFramePr>
+            <a:graphic xmlns:a="http://schemas.openxmlformats.org/drawingml/2006/main">
+              <a:graphicData uri="http://schemas.openxmlformats.org/drawingml/2006/picture">
+                <pic:pic xmlns:pic="http://schemas.openxmlformats.org/drawingml/2006/picture">
+                  <pic:nvPicPr>
+                    <pic:cNvPr id="77681" name="Picture 77681" descr="Map of Greater London with a 10 km buffer. Red patches mark persistent urban heat island areas with mean land surface temperature of 40.56°C or more, clustered in east London, the western edge and south of the River Thames."/>
+                    <pic:cNvPicPr/>
+                  </pic:nvPicPr>
+                  <pic:blipFill>
+                    <a:blip r:embed="rIdImg2"/>
+                    <a:stretch>
+                      <a:fillRect/>
+                    </a:stretch>
+                  </pic:blipFill>
+                  <pic:spPr>
+                    <a:xfrm>
+                      <a:off x="0" y="0"/>
+                      <a:ext cx="3240000" cy="3311494"/>
+                    </a:xfrm>
+                    <a:prstGeom prst="rect">
+                      <a:avLst/>
+                    </a:prstGeom>
+                  </pic:spPr>
+                </pic:pic>
+              </a:graphicData>
+            </a:graphic>
+          </wp:inline>
+        </w:drawing>
+      </w:r>
+    </w:p>
+    <w:p>
+      <w:r>
+        <w:t xml:space="preserve">Figure 2. Urban heat island areas, Greater London, 2013 to 2023. Source: Krenz and Amann (2025), Figure 2b, CC BY 4.0.</w:t>
+      </w:r>
+    </w:p>
+    <w:p>
+      <w:pPr>
+        <w:pStyle w:val="Heading2"/>
+      </w:pPr>
+      <w:r>
         <w:t xml:space="preserve">Land surface temperature</w:t>
       </w:r>
     </w:p>
     <w:p>
       <w:r>
-        <w:t xml:space="preserve">Satellite surface temperature shows the same pattern. Hot-season surface temperatures across south London range from about 33°C to 43°C, with the Thames and large green spaces coolest (WRI, 2026). Surface temperature exceeds air temperature, so this shows pattern, not rank.</w:t>
+        <w:t xml:space="preserve">The WRI Cool Cities Lab shows the same pattern at street scale. Hot-season surface temperatures across south London range from about 33°C to 43°C, with the Thames and large green spaces coolest (WRI, 2026). Surface temperature exceeds air temperature, so this shows pattern, not rank.</w:t>
       </w:r>
     </w:p>
     <w:p>
@@ -323,7 +399,7 @@
           <wp:inline distT="0" distB="0" distL="0" distR="0">
             <wp:extent cx="3060000" cy="2316680"/>
             <wp:effectExtent l="0" t="0" r="0" b="0"/>
-            <wp:docPr id="833181" name="Picture 833181" descr="Heat map of south London showing land surface temperature from 33°C (pale yellow) to 43°C (dark red). The River Thames and parks are coolest; dense built-up areas are hottest."/>
+            <wp:docPr id="587827" name="Picture 587827" descr="Heat map of south London showing land surface temperature from 33°C (pale yellow) to 43°C (dark red). The River Thames and parks are coolest; dense built-up areas are hottest."/>
             <wp:cNvGraphicFramePr>
               <a:graphicFrameLocks xmlns:a="http://schemas.openxmlformats.org/drawingml/2006/main" noChangeAspect="1"/>
             </wp:cNvGraphicFramePr>
@@ -331,11 +407,11 @@
               <a:graphicData uri="http://schemas.openxmlformats.org/drawingml/2006/picture">
                 <pic:pic xmlns:pic="http://schemas.openxmlformats.org/drawingml/2006/picture">
                   <pic:nvPicPr>
-                    <pic:cNvPr id="833181" name="Picture 833181" descr="Heat map of south London showing land surface temperature from 33°C (pale yellow) to 43°C (dark red). The River Thames and parks are coolest; dense built-up areas are hottest."/>
+                    <pic:cNvPr id="587827" name="Picture 587827" descr="Heat map of south London showing land surface temperature from 33°C (pale yellow) to 43°C (dark red). The River Thames and parks are coolest; dense built-up areas are hottest."/>
                     <pic:cNvPicPr/>
                   </pic:nvPicPr>
                   <pic:blipFill>
-                    <a:blip r:embed="rIdImg2"/>
+                    <a:blip r:embed="rIdImg3"/>
                     <a:stretch>
                       <a:fillRect/>
                     </a:stretch>
@@ -358,7 +434,7 @@
     </w:p>
     <w:p>
       <w:r>
-        <w:t xml:space="preserve">Figure 2. Land surface temperature, 95th percentile hot season (°C). Source: WRI (2026).</w:t>
+        <w:t xml:space="preserve">Figure 3. Land surface temperature, 95th percentile hot season (°C). Source: WRI (2026).</w:t>
       </w:r>
     </w:p>
     <w:p>
@@ -373,7 +449,7 @@
       <w:r>
         <w:t xml:space="preserve">Arup (2023) Urban Heat Snapshot. London: Arup. Available at: </w:t>
       </w:r>
-      <w:hyperlink r:id="rIdLink3" w:history="1">
+      <w:hyperlink r:id="rIdLink4" w:history="1">
         <w:r>
           <w:rPr>
             <w:rStyle w:val="Hyperlink"/>
@@ -389,7 +465,7 @@
       <w:r>
         <w:t xml:space="preserve">Greater London Authority and Arup (2024) Properties Vulnerable to Heat Impacts in London: Prioritisation for Adaptation Interventions. London: Greater London Authority. Available at: </w:t>
       </w:r>
-      <w:hyperlink r:id="rIdLink4" w:history="1">
+      <w:hyperlink r:id="rIdLink5" w:history="1">
         <w:r>
           <w:rPr>
             <w:rStyle w:val="Hyperlink"/>
@@ -405,7 +481,7 @@
       <w:r>
         <w:t xml:space="preserve">Krenz, K. and Amann, L. (2025) ’Urban heat island effect: examining spatial patterns of socio-demographic inequalities in Greater London’, Cities &amp; Health, 9(5), pp. 901 to 924. Available at: </w:t>
       </w:r>
-      <w:hyperlink r:id="rIdLink5" w:history="1">
+      <w:hyperlink r:id="rIdLink6" w:history="1">
         <w:r>
           <w:rPr>
             <w:rStyle w:val="Hyperlink"/>
@@ -421,7 +497,7 @@
       <w:r>
         <w:t xml:space="preserve">London Climate Ready Partnership (n.d.) Heatwaves. Available at: </w:t>
       </w:r>
-      <w:hyperlink r:id="rIdLink6" w:history="1">
+      <w:hyperlink r:id="rIdLink7" w:history="1">
         <w:r>
           <w:rPr>
             <w:rStyle w:val="Hyperlink"/>
@@ -437,7 +513,7 @@
       <w:r>
         <w:t xml:space="preserve">Simpson, C.H., Brousse, O. and Heaviside, C. (2024) ’Estimated mortality attributable to the urban heat island during the record-breaking 2022 heatwave in London’, Environmental Research Letters, 19(9), 094047. Available at: </w:t>
       </w:r>
-      <w:hyperlink r:id="rIdLink7" w:history="1">
+      <w:hyperlink r:id="rIdLink8" w:history="1">
         <w:r>
           <w:rPr>
             <w:rStyle w:val="Hyperlink"/>
@@ -458,7 +534,7 @@
       <w:r>
         <w:t xml:space="preserve">World Resources Institute (WRI) (2026) Cool Cities Lab. Washington, DC: WRI Ross Center for Sustainable Cities. Available at: </w:t>
       </w:r>
-      <w:hyperlink r:id="rIdLink8" w:history="1">
+      <w:hyperlink r:id="rIdLink9" w:history="1">
         <w:r>
           <w:rPr>
             <w:rStyle w:val="Hyperlink"/>

</xml_diff>